<commit_message>
Remove internal QA gate checklist from the Neo-facing draft
That section was internal bookkeeping from the fix pass, not something
that belongs in a document going to Neo for approval. Kept the actionable
Before This Can Be Submitted items (Darius sign-off, attachments).
</commit_message>
<xml_diff>
--- a/app/drafts/2026-07-eom-vpart-goodzone-violence-prevention.docx
+++ b/app/drafts/2026-07-eom-vpart-goodzone-violence-prevention.docx
@@ -2971,236 +2971,7 @@
           <w:color w:val="2C3E50"/>
           <w:sz w:val="28"/>
         </w:rPr>
-        <w:t>Pre-Submission QA Gate</w:t>
-      </w:r>
-    </w:p>
-    <w:p>
-      <w:pPr>
-        <w:spacing w:after="60"/>
-      </w:pPr>
-      <w:r>
-        <w:rPr>
-          <w:sz w:val="21"/>
-        </w:rPr>
-        <w:t xml:space="preserve">01  ☒  </w:t>
-      </w:r>
-      <w:r>
-        <w:rPr>
-          <w:sz w:val="21"/>
-        </w:rPr>
-        <w:t>All placeholders filled with real content</w:t>
-      </w:r>
-    </w:p>
-    <w:p>
-      <w:pPr>
-        <w:spacing w:after="60"/>
-      </w:pPr>
-      <w:r>
-        <w:rPr>
-          <w:sz w:val="21"/>
-        </w:rPr>
-        <w:t xml:space="preserve">02  ☒  </w:t>
-      </w:r>
-      <w:r>
-        <w:rPr>
-          <w:sz w:val="21"/>
-        </w:rPr>
-        <w:t>Funder ask ($50,000) is at, not over, the stated cap</w:t>
-      </w:r>
-    </w:p>
-    <w:p>
-      <w:pPr>
-        <w:spacing w:after="60"/>
-      </w:pPr>
-      <w:r>
-        <w:rPr>
-          <w:sz w:val="21"/>
-        </w:rPr>
-        <w:t xml:space="preserve">03  ☒  </w:t>
-      </w:r>
-      <w:r>
-        <w:rPr>
-          <w:sz w:val="21"/>
-        </w:rPr>
-        <w:t>Budget total ($1,189,403) confirmed with Neo on the VPART portal</w:t>
-      </w:r>
-    </w:p>
-    <w:p>
-      <w:pPr>
-        <w:spacing w:after="60"/>
-      </w:pPr>
-      <w:r>
-        <w:rPr>
-          <w:sz w:val="21"/>
-        </w:rPr>
-        <w:t xml:space="preserve">04  ☒  </w:t>
-      </w:r>
-      <w:r>
-        <w:rPr>
-          <w:sz w:val="21"/>
-        </w:rPr>
-        <w:t>No Cara Adams in the staffing section</w:t>
-      </w:r>
-    </w:p>
-    <w:p>
-      <w:pPr>
-        <w:spacing w:after="60"/>
-      </w:pPr>
-      <w:r>
-        <w:rPr>
-          <w:sz w:val="21"/>
-        </w:rPr>
-        <w:t xml:space="preserve">05  ☒  </w:t>
-      </w:r>
-      <w:r>
-        <w:rPr>
-          <w:sz w:val="21"/>
-        </w:rPr>
-        <w:t>Address reads: 996 Maine Avenue SW, Suite 208, Washington, DC 20024</w:t>
-      </w:r>
-    </w:p>
-    <w:p>
-      <w:pPr>
-        <w:spacing w:after="60"/>
-      </w:pPr>
-      <w:r>
-        <w:rPr>
-          <w:sz w:val="21"/>
-        </w:rPr>
-        <w:t xml:space="preserve">06  ☒  </w:t>
-      </w:r>
-      <w:r>
-        <w:rPr>
-          <w:sz w:val="21"/>
-        </w:rPr>
-        <w:t>Geography confirmed: physical service sites are Ward 6 (Q17); population served is described as Ward 6 and Ward 8 (Q8, Q9, Q10, Q14, Q16), consistent with language GOODProjects has used in other current GOODZone drafts</w:t>
-      </w:r>
-    </w:p>
-    <w:p>
-      <w:pPr>
-        <w:spacing w:after="60"/>
-      </w:pPr>
-      <w:r>
-        <w:rPr>
-          <w:sz w:val="21"/>
-        </w:rPr>
-        <w:t xml:space="preserve">07  ☒  </w:t>
-      </w:r>
-      <w:r>
-        <w:rPr>
-          <w:sz w:val="21"/>
-        </w:rPr>
-        <w:t>Proof metrics chosen (conflict mediations, engagement counts, referrals) match VPART's violence-prevention domain</w:t>
-      </w:r>
-    </w:p>
-    <w:p>
-      <w:pPr>
-        <w:spacing w:after="60"/>
-      </w:pPr>
-      <w:r>
-        <w:rPr>
-          <w:sz w:val="21"/>
-        </w:rPr>
-        <w:t xml:space="preserve">08  ☒  </w:t>
-      </w:r>
-      <w:r>
-        <w:rPr>
-          <w:sz w:val="21"/>
-        </w:rPr>
-        <w:t>All work plan dates are valid and fall inside the Nov 2026-Sep 2027 project period</w:t>
-      </w:r>
-    </w:p>
-    <w:p>
-      <w:pPr>
-        <w:spacing w:after="60"/>
-      </w:pPr>
-      <w:r>
-        <w:rPr>
-          <w:sz w:val="21"/>
-        </w:rPr>
-        <w:t xml:space="preserve">09  ☒  </w:t>
-      </w:r>
-      <w:r>
-        <w:rPr>
-          <w:sz w:val="21"/>
-        </w:rPr>
-        <w:t>No machine artifacts, character-counter text, or stray formatting characters left in any answer</w:t>
-      </w:r>
-    </w:p>
-    <w:p>
-      <w:pPr>
-        <w:spacing w:after="60"/>
-      </w:pPr>
-      <w:r>
-        <w:rPr>
-          <w:sz w:val="21"/>
-        </w:rPr>
-        <w:t xml:space="preserve">10  ☒  </w:t>
-      </w:r>
-      <w:r>
-        <w:rPr>
-          <w:sz w:val="21"/>
-        </w:rPr>
-        <w:t>No em or en dashes in GOODProjects' own answer text (the RFA's own Service Area option labels are left as the funder wrote them)</w:t>
-      </w:r>
-    </w:p>
-    <w:p>
-      <w:pPr>
-        <w:spacing w:after="60"/>
-      </w:pPr>
-      <w:r>
-        <w:rPr>
-          <w:sz w:val="21"/>
-        </w:rPr>
-        <w:t xml:space="preserve">11  ☐  </w:t>
-      </w:r>
-      <w:r>
-        <w:rPr>
-          <w:sz w:val="21"/>
-        </w:rPr>
-        <w:t>Certification (Q25) and Q4 (hosting the Mayor) both need Darius Baxter's personal confirmation before this goes out</w:t>
-      </w:r>
-    </w:p>
-    <w:p>
-      <w:pPr>
-        <w:spacing w:after="60"/>
-      </w:pPr>
-      <w:r>
-        <w:rPr>
-          <w:sz w:val="21"/>
-        </w:rPr>
-        <w:t xml:space="preserve">12  ☐  </w:t>
-      </w:r>
-      <w:r>
-        <w:rPr>
-          <w:sz w:val="21"/>
-        </w:rPr>
-        <w:t>Attachments not yet assembled; see Open Items below</w:t>
-      </w:r>
-    </w:p>
-    <w:p>
-      <w:pPr>
-        <w:pBdr>
-          <w:bottom w:val="single" w:sz="6" w:space="1" w:color="BFBFBF"/>
-        </w:pBdr>
-        <w:spacing w:before="80" w:after="80"/>
-      </w:pPr>
-    </w:p>
-    <w:p>
-      <w:pPr>
-        <w:keepNext/>
-        <w:spacing w:before="360" w:after="160"/>
-        <w:pBdr>
-          <w:bottom w:val="single" w:sz="6" w:space="4" w:color="2c3e50"/>
-        </w:pBdr>
-      </w:pPr>
-      <w:r>
-        <w:rPr>
-          <w:b/>
-          <w:color w:val="2C3E50"/>
-          <w:sz w:val="28"/>
-        </w:rPr>
-        <w:t>Open Items Before This Can Be Submitted</w:t>
+        <w:t>Before This Can Be Submitted</w:t>
       </w:r>
     </w:p>
     <w:p>

</xml_diff>

<commit_message>
Rebuild Word doc without raw-XML formatting hacks
The previous version used manual OxmlElement insertion for heading
borders and table cell shading, which can violate OOXML's strict
element-ordering rules and cause the file to fail validation in strict
parsers (Google Drive's converter in particular). Rebuilt using only
python-docx's high-level, order-safe APIs.
</commit_message>
<xml_diff>
--- a/app/drafts/2026-07-eom-vpart-goodzone-violence-prevention.docx
+++ b/app/drafts/2026-07-eom-vpart-goodzone-violence-prevention.docx
@@ -9,7 +9,6 @@
       <w:r>
         <w:rPr>
           <w:b/>
-          <w:color w:val="1A1A1A"/>
           <w:sz w:val="40"/>
         </w:rPr>
         <w:t>GOODProjects</w:t>
@@ -38,7 +37,7 @@
           <w:color w:val="444444"/>
           <w:sz w:val="24"/>
         </w:rPr>
-        <w:t>VPART (Violence Prevention and Response) FY27, Violence Prevention Track — GOODZone</w:t>
+        <w:t>VPART (Violence Prevention and Response) FY27, Violence Prevention Track, GOODZone</w:t>
       </w:r>
     </w:p>
     <w:p>
@@ -52,7 +51,7 @@
         <w:t xml:space="preserve">STATUS: </w:t>
       </w:r>
       <w:r>
-        <w:t>Final draft for Neo's approval. Budget confirmed with Neo directly on the VPART portal. Writing, grammar, and formatting are finalized below. Two small sign-offs remain before submission; see Open Items at the end.</w:t>
+        <w:t>Final draft for Neo's approval. Budget confirmed with Neo directly on the VPART portal. Writing, grammar, and formatting are finalized below. Two small sign-offs remain before submission; see the note at the end.</w:t>
       </w:r>
     </w:p>
     <w:p>
@@ -141,25 +140,25 @@
     </w:p>
     <w:p>
       <w:pPr>
-        <w:pBdr>
-          <w:bottom w:val="single" w:sz="6" w:space="1" w:color="BFBFBF"/>
-        </w:pBdr>
         <w:spacing w:before="80" w:after="80"/>
-      </w:pPr>
+        <w:jc w:val="center"/>
+      </w:pPr>
+      <w:r>
+        <w:rPr>
+          <w:color w:val="BFBFBF"/>
+          <w:sz w:val="18"/>
+        </w:rPr>
+        <w:t>――――――――――――――――――――――――――――――――――――――――</w:t>
+      </w:r>
     </w:p>
     <w:p>
       <w:pPr>
-        <w:keepNext/>
+        <w:pStyle w:val="Heading2"/>
         <w:spacing w:before="360" w:after="160"/>
-        <w:pBdr>
-          <w:bottom w:val="single" w:sz="6" w:space="4" w:color="2c3e50"/>
-        </w:pBdr>
       </w:pPr>
       <w:r>
         <w:rPr>
-          <w:b/>
           <w:color w:val="2C3E50"/>
-          <w:sz w:val="28"/>
         </w:rPr>
         <w:t>Organization Questions</w:t>
       </w:r>
@@ -236,7 +235,7 @@
         <w:rPr>
           <w:sz w:val="22"/>
         </w:rPr>
-        <w:t>☒  Ward 6</w:t>
+        <w:t>☑  Ward 6</w:t>
       </w:r>
     </w:p>
     <w:p>
@@ -395,7 +394,7 @@
         <w:rPr>
           <w:sz w:val="22"/>
         </w:rPr>
-        <w:t>☒  Yes</w:t>
+        <w:t>☑  Yes</w:t>
       </w:r>
     </w:p>
     <w:p>
@@ -498,25 +497,25 @@
     </w:p>
     <w:p>
       <w:pPr>
-        <w:pBdr>
-          <w:bottom w:val="single" w:sz="6" w:space="1" w:color="BFBFBF"/>
-        </w:pBdr>
         <w:spacing w:before="80" w:after="80"/>
-      </w:pPr>
+        <w:jc w:val="center"/>
+      </w:pPr>
+      <w:r>
+        <w:rPr>
+          <w:color w:val="BFBFBF"/>
+          <w:sz w:val="18"/>
+        </w:rPr>
+        <w:t>――――――――――――――――――――――――――――――――――――――――</w:t>
+      </w:r>
     </w:p>
     <w:p>
       <w:pPr>
-        <w:keepNext/>
+        <w:pStyle w:val="Heading2"/>
         <w:spacing w:before="360" w:after="160"/>
-        <w:pBdr>
-          <w:bottom w:val="single" w:sz="6" w:space="4" w:color="2c3e50"/>
-        </w:pBdr>
       </w:pPr>
       <w:r>
         <w:rPr>
-          <w:b/>
           <w:color w:val="2C3E50"/>
-          <w:sz w:val="28"/>
         </w:rPr>
         <w:t>Program Questions</w:t>
       </w:r>
@@ -815,7 +814,7 @@
         <w:rPr>
           <w:sz w:val="22"/>
         </w:rPr>
-        <w:t>☒  Ward 6</w:t>
+        <w:t>☑  Ward 6</w:t>
       </w:r>
     </w:p>
     <w:p>
@@ -827,7 +826,7 @@
         <w:rPr>
           <w:sz w:val="22"/>
         </w:rPr>
-        <w:t>☒  Ward 8</w:t>
+        <w:t>☑  Ward 8</w:t>
       </w:r>
     </w:p>
     <w:p>
@@ -960,7 +959,7 @@
         <w:rPr>
           <w:sz w:val="22"/>
         </w:rPr>
-        <w:t>☒  Mental Health Services</w:t>
+        <w:t>☑  Mental Health Services</w:t>
       </w:r>
     </w:p>
     <w:p>
@@ -984,7 +983,7 @@
         <w:rPr>
           <w:sz w:val="22"/>
         </w:rPr>
-        <w:t>☒  Training</w:t>
+        <w:t>☑  Training</w:t>
       </w:r>
     </w:p>
     <w:p>
@@ -996,7 +995,7 @@
         <w:rPr>
           <w:sz w:val="22"/>
         </w:rPr>
-        <w:t>☒  Community Engagement</w:t>
+        <w:t>☑  Community Engagement</w:t>
       </w:r>
     </w:p>
     <w:p>
@@ -1008,7 +1007,7 @@
         <w:rPr>
           <w:sz w:val="22"/>
         </w:rPr>
-        <w:t>☒  Harm Reduction Interventions</w:t>
+        <w:t>☑  Harm Reduction Interventions</w:t>
       </w:r>
     </w:p>
     <w:p>
@@ -1405,7 +1404,7 @@
         <w:rPr>
           <w:sz w:val="22"/>
         </w:rPr>
-        <w:t>☒  Yes</w:t>
+        <w:t>☑  Yes</w:t>
       </w:r>
     </w:p>
     <w:p>
@@ -1422,25 +1421,25 @@
     </w:p>
     <w:p>
       <w:pPr>
-        <w:pBdr>
-          <w:bottom w:val="single" w:sz="6" w:space="1" w:color="BFBFBF"/>
-        </w:pBdr>
         <w:spacing w:before="80" w:after="80"/>
-      </w:pPr>
+        <w:jc w:val="center"/>
+      </w:pPr>
+      <w:r>
+        <w:rPr>
+          <w:color w:val="BFBFBF"/>
+          <w:sz w:val="18"/>
+        </w:rPr>
+        <w:t>――――――――――――――――――――――――――――――――――――――――</w:t>
+      </w:r>
     </w:p>
     <w:p>
       <w:pPr>
-        <w:keepNext/>
+        <w:pStyle w:val="Heading2"/>
         <w:spacing w:before="360" w:after="160"/>
-        <w:pBdr>
-          <w:bottom w:val="single" w:sz="6" w:space="4" w:color="2c3e50"/>
-        </w:pBdr>
       </w:pPr>
       <w:r>
         <w:rPr>
-          <w:b/>
           <w:color w:val="2C3E50"/>
-          <w:sz w:val="28"/>
         </w:rPr>
         <w:t>Work Plan</w:t>
       </w:r>
@@ -1460,8 +1459,6 @@
       <w:tblPr>
         <w:tblStyle w:val="TableGrid"/>
         <w:tblW w:type="auto" w:w="0"/>
-        <w:jc w:val="center"/>
-        <w:tblLayout w:type="fixed"/>
         <w:tblLook w:firstColumn="1" w:firstRow="1" w:lastColumn="0" w:lastRow="0" w:noHBand="0" w:noVBand="1" w:val="04A0"/>
       </w:tblPr>
       <w:tblGrid>
@@ -1474,13 +1471,6 @@
         <w:tc>
           <w:tcPr>
             <w:tcW w:type="dxa" w:w="5472"/>
-            <w:shd w:val="clear" w:color="auto" w:fill="2c3e50"/>
-            <w:tcMar>
-              <w:top w:w="60" w:type="dxa"/>
-              <w:left w:w="60" w:type="dxa"/>
-              <w:bottom w:w="60" w:type="dxa"/>
-              <w:right w:w="60" w:type="dxa"/>
-            </w:tcMar>
           </w:tcPr>
           <w:p>
             <w:pPr>
@@ -1490,7 +1480,6 @@
             <w:r>
               <w:rPr>
                 <w:b/>
-                <w:color w:val="FFFFFF"/>
                 <w:sz w:val="19"/>
               </w:rPr>
               <w:t>Activity</w:t>
@@ -1500,13 +1489,6 @@
         <w:tc>
           <w:tcPr>
             <w:tcW w:type="dxa" w:w="2304"/>
-            <w:shd w:val="clear" w:color="auto" w:fill="2c3e50"/>
-            <w:tcMar>
-              <w:top w:w="60" w:type="dxa"/>
-              <w:left w:w="60" w:type="dxa"/>
-              <w:bottom w:w="60" w:type="dxa"/>
-              <w:right w:w="60" w:type="dxa"/>
-            </w:tcMar>
           </w:tcPr>
           <w:p>
             <w:pPr>
@@ -1516,7 +1498,6 @@
             <w:r>
               <w:rPr>
                 <w:b/>
-                <w:color w:val="FFFFFF"/>
                 <w:sz w:val="19"/>
               </w:rPr>
               <w:t>Responsible</w:t>
@@ -1526,13 +1507,6 @@
         <w:tc>
           <w:tcPr>
             <w:tcW w:type="dxa" w:w="1008"/>
-            <w:shd w:val="clear" w:color="auto" w:fill="2c3e50"/>
-            <w:tcMar>
-              <w:top w:w="60" w:type="dxa"/>
-              <w:left w:w="60" w:type="dxa"/>
-              <w:bottom w:w="60" w:type="dxa"/>
-              <w:right w:w="60" w:type="dxa"/>
-            </w:tcMar>
           </w:tcPr>
           <w:p>
             <w:pPr>
@@ -1542,7 +1516,6 @@
             <w:r>
               <w:rPr>
                 <w:b/>
-                <w:color w:val="FFFFFF"/>
                 <w:sz w:val="19"/>
               </w:rPr>
               <w:t>Start</w:t>
@@ -1552,13 +1525,6 @@
         <w:tc>
           <w:tcPr>
             <w:tcW w:type="dxa" w:w="1008"/>
-            <w:shd w:val="clear" w:color="auto" w:fill="2c3e50"/>
-            <w:tcMar>
-              <w:top w:w="60" w:type="dxa"/>
-              <w:left w:w="60" w:type="dxa"/>
-              <w:bottom w:w="60" w:type="dxa"/>
-              <w:right w:w="60" w:type="dxa"/>
-            </w:tcMar>
           </w:tcPr>
           <w:p>
             <w:pPr>
@@ -1568,7 +1534,6 @@
             <w:r>
               <w:rPr>
                 <w:b/>
-                <w:color w:val="FFFFFF"/>
                 <w:sz w:val="19"/>
               </w:rPr>
               <w:t>End</w:t>
@@ -1580,12 +1545,6 @@
         <w:tc>
           <w:tcPr>
             <w:tcW w:type="dxa" w:w="5472"/>
-            <w:tcMar>
-              <w:top w:w="60" w:type="dxa"/>
-              <w:left w:w="60" w:type="dxa"/>
-              <w:bottom w:w="60" w:type="dxa"/>
-              <w:right w:w="60" w:type="dxa"/>
-            </w:tcMar>
           </w:tcPr>
           <w:p>
             <w:pPr>
@@ -1604,12 +1563,6 @@
         <w:tc>
           <w:tcPr>
             <w:tcW w:type="dxa" w:w="2304"/>
-            <w:tcMar>
-              <w:top w:w="60" w:type="dxa"/>
-              <w:left w:w="60" w:type="dxa"/>
-              <w:bottom w:w="60" w:type="dxa"/>
-              <w:right w:w="60" w:type="dxa"/>
-            </w:tcMar>
           </w:tcPr>
           <w:p>
             <w:pPr>
@@ -1628,12 +1581,6 @@
         <w:tc>
           <w:tcPr>
             <w:tcW w:type="dxa" w:w="1008"/>
-            <w:tcMar>
-              <w:top w:w="60" w:type="dxa"/>
-              <w:left w:w="60" w:type="dxa"/>
-              <w:bottom w:w="60" w:type="dxa"/>
-              <w:right w:w="60" w:type="dxa"/>
-            </w:tcMar>
           </w:tcPr>
           <w:p>
             <w:pPr>
@@ -1652,12 +1599,6 @@
         <w:tc>
           <w:tcPr>
             <w:tcW w:type="dxa" w:w="1008"/>
-            <w:tcMar>
-              <w:top w:w="60" w:type="dxa"/>
-              <w:left w:w="60" w:type="dxa"/>
-              <w:bottom w:w="60" w:type="dxa"/>
-              <w:right w:w="60" w:type="dxa"/>
-            </w:tcMar>
           </w:tcPr>
           <w:p>
             <w:pPr>
@@ -1678,12 +1619,6 @@
         <w:tc>
           <w:tcPr>
             <w:tcW w:type="dxa" w:w="5472"/>
-            <w:tcMar>
-              <w:top w:w="60" w:type="dxa"/>
-              <w:left w:w="60" w:type="dxa"/>
-              <w:bottom w:w="60" w:type="dxa"/>
-              <w:right w:w="60" w:type="dxa"/>
-            </w:tcMar>
           </w:tcPr>
           <w:p>
             <w:pPr>
@@ -1702,12 +1637,6 @@
         <w:tc>
           <w:tcPr>
             <w:tcW w:type="dxa" w:w="2304"/>
-            <w:tcMar>
-              <w:top w:w="60" w:type="dxa"/>
-              <w:left w:w="60" w:type="dxa"/>
-              <w:bottom w:w="60" w:type="dxa"/>
-              <w:right w:w="60" w:type="dxa"/>
-            </w:tcMar>
           </w:tcPr>
           <w:p>
             <w:pPr>
@@ -1726,12 +1655,6 @@
         <w:tc>
           <w:tcPr>
             <w:tcW w:type="dxa" w:w="1008"/>
-            <w:tcMar>
-              <w:top w:w="60" w:type="dxa"/>
-              <w:left w:w="60" w:type="dxa"/>
-              <w:bottom w:w="60" w:type="dxa"/>
-              <w:right w:w="60" w:type="dxa"/>
-            </w:tcMar>
           </w:tcPr>
           <w:p>
             <w:pPr>
@@ -1750,12 +1673,6 @@
         <w:tc>
           <w:tcPr>
             <w:tcW w:type="dxa" w:w="1008"/>
-            <w:tcMar>
-              <w:top w:w="60" w:type="dxa"/>
-              <w:left w:w="60" w:type="dxa"/>
-              <w:bottom w:w="60" w:type="dxa"/>
-              <w:right w:w="60" w:type="dxa"/>
-            </w:tcMar>
           </w:tcPr>
           <w:p>
             <w:pPr>
@@ -1776,12 +1693,6 @@
         <w:tc>
           <w:tcPr>
             <w:tcW w:type="dxa" w:w="5472"/>
-            <w:tcMar>
-              <w:top w:w="60" w:type="dxa"/>
-              <w:left w:w="60" w:type="dxa"/>
-              <w:bottom w:w="60" w:type="dxa"/>
-              <w:right w:w="60" w:type="dxa"/>
-            </w:tcMar>
           </w:tcPr>
           <w:p>
             <w:pPr>
@@ -1800,12 +1711,6 @@
         <w:tc>
           <w:tcPr>
             <w:tcW w:type="dxa" w:w="2304"/>
-            <w:tcMar>
-              <w:top w:w="60" w:type="dxa"/>
-              <w:left w:w="60" w:type="dxa"/>
-              <w:bottom w:w="60" w:type="dxa"/>
-              <w:right w:w="60" w:type="dxa"/>
-            </w:tcMar>
           </w:tcPr>
           <w:p>
             <w:pPr>
@@ -1824,12 +1729,6 @@
         <w:tc>
           <w:tcPr>
             <w:tcW w:type="dxa" w:w="1008"/>
-            <w:tcMar>
-              <w:top w:w="60" w:type="dxa"/>
-              <w:left w:w="60" w:type="dxa"/>
-              <w:bottom w:w="60" w:type="dxa"/>
-              <w:right w:w="60" w:type="dxa"/>
-            </w:tcMar>
           </w:tcPr>
           <w:p>
             <w:pPr>
@@ -1848,12 +1747,6 @@
         <w:tc>
           <w:tcPr>
             <w:tcW w:type="dxa" w:w="1008"/>
-            <w:tcMar>
-              <w:top w:w="60" w:type="dxa"/>
-              <w:left w:w="60" w:type="dxa"/>
-              <w:bottom w:w="60" w:type="dxa"/>
-              <w:right w:w="60" w:type="dxa"/>
-            </w:tcMar>
           </w:tcPr>
           <w:p>
             <w:pPr>
@@ -1874,12 +1767,6 @@
         <w:tc>
           <w:tcPr>
             <w:tcW w:type="dxa" w:w="5472"/>
-            <w:tcMar>
-              <w:top w:w="60" w:type="dxa"/>
-              <w:left w:w="60" w:type="dxa"/>
-              <w:bottom w:w="60" w:type="dxa"/>
-              <w:right w:w="60" w:type="dxa"/>
-            </w:tcMar>
           </w:tcPr>
           <w:p>
             <w:pPr>
@@ -1898,12 +1785,6 @@
         <w:tc>
           <w:tcPr>
             <w:tcW w:type="dxa" w:w="2304"/>
-            <w:tcMar>
-              <w:top w:w="60" w:type="dxa"/>
-              <w:left w:w="60" w:type="dxa"/>
-              <w:bottom w:w="60" w:type="dxa"/>
-              <w:right w:w="60" w:type="dxa"/>
-            </w:tcMar>
           </w:tcPr>
           <w:p>
             <w:pPr>
@@ -1922,12 +1803,6 @@
         <w:tc>
           <w:tcPr>
             <w:tcW w:type="dxa" w:w="1008"/>
-            <w:tcMar>
-              <w:top w:w="60" w:type="dxa"/>
-              <w:left w:w="60" w:type="dxa"/>
-              <w:bottom w:w="60" w:type="dxa"/>
-              <w:right w:w="60" w:type="dxa"/>
-            </w:tcMar>
           </w:tcPr>
           <w:p>
             <w:pPr>
@@ -1946,12 +1821,6 @@
         <w:tc>
           <w:tcPr>
             <w:tcW w:type="dxa" w:w="1008"/>
-            <w:tcMar>
-              <w:top w:w="60" w:type="dxa"/>
-              <w:left w:w="60" w:type="dxa"/>
-              <w:bottom w:w="60" w:type="dxa"/>
-              <w:right w:w="60" w:type="dxa"/>
-            </w:tcMar>
           </w:tcPr>
           <w:p>
             <w:pPr>
@@ -1972,12 +1841,6 @@
         <w:tc>
           <w:tcPr>
             <w:tcW w:type="dxa" w:w="5472"/>
-            <w:tcMar>
-              <w:top w:w="60" w:type="dxa"/>
-              <w:left w:w="60" w:type="dxa"/>
-              <w:bottom w:w="60" w:type="dxa"/>
-              <w:right w:w="60" w:type="dxa"/>
-            </w:tcMar>
           </w:tcPr>
           <w:p>
             <w:pPr>
@@ -1996,12 +1859,6 @@
         <w:tc>
           <w:tcPr>
             <w:tcW w:type="dxa" w:w="2304"/>
-            <w:tcMar>
-              <w:top w:w="60" w:type="dxa"/>
-              <w:left w:w="60" w:type="dxa"/>
-              <w:bottom w:w="60" w:type="dxa"/>
-              <w:right w:w="60" w:type="dxa"/>
-            </w:tcMar>
           </w:tcPr>
           <w:p>
             <w:pPr>
@@ -2020,12 +1877,6 @@
         <w:tc>
           <w:tcPr>
             <w:tcW w:type="dxa" w:w="1008"/>
-            <w:tcMar>
-              <w:top w:w="60" w:type="dxa"/>
-              <w:left w:w="60" w:type="dxa"/>
-              <w:bottom w:w="60" w:type="dxa"/>
-              <w:right w:w="60" w:type="dxa"/>
-            </w:tcMar>
           </w:tcPr>
           <w:p>
             <w:pPr>
@@ -2044,12 +1895,6 @@
         <w:tc>
           <w:tcPr>
             <w:tcW w:type="dxa" w:w="1008"/>
-            <w:tcMar>
-              <w:top w:w="60" w:type="dxa"/>
-              <w:left w:w="60" w:type="dxa"/>
-              <w:bottom w:w="60" w:type="dxa"/>
-              <w:right w:w="60" w:type="dxa"/>
-            </w:tcMar>
           </w:tcPr>
           <w:p>
             <w:pPr>
@@ -2070,12 +1915,6 @@
         <w:tc>
           <w:tcPr>
             <w:tcW w:type="dxa" w:w="5472"/>
-            <w:tcMar>
-              <w:top w:w="60" w:type="dxa"/>
-              <w:left w:w="60" w:type="dxa"/>
-              <w:bottom w:w="60" w:type="dxa"/>
-              <w:right w:w="60" w:type="dxa"/>
-            </w:tcMar>
           </w:tcPr>
           <w:p>
             <w:pPr>
@@ -2094,12 +1933,6 @@
         <w:tc>
           <w:tcPr>
             <w:tcW w:type="dxa" w:w="2304"/>
-            <w:tcMar>
-              <w:top w:w="60" w:type="dxa"/>
-              <w:left w:w="60" w:type="dxa"/>
-              <w:bottom w:w="60" w:type="dxa"/>
-              <w:right w:w="60" w:type="dxa"/>
-            </w:tcMar>
           </w:tcPr>
           <w:p>
             <w:pPr>
@@ -2118,12 +1951,6 @@
         <w:tc>
           <w:tcPr>
             <w:tcW w:type="dxa" w:w="1008"/>
-            <w:tcMar>
-              <w:top w:w="60" w:type="dxa"/>
-              <w:left w:w="60" w:type="dxa"/>
-              <w:bottom w:w="60" w:type="dxa"/>
-              <w:right w:w="60" w:type="dxa"/>
-            </w:tcMar>
           </w:tcPr>
           <w:p>
             <w:pPr>
@@ -2142,12 +1969,6 @@
         <w:tc>
           <w:tcPr>
             <w:tcW w:type="dxa" w:w="1008"/>
-            <w:tcMar>
-              <w:top w:w="60" w:type="dxa"/>
-              <w:left w:w="60" w:type="dxa"/>
-              <w:bottom w:w="60" w:type="dxa"/>
-              <w:right w:w="60" w:type="dxa"/>
-            </w:tcMar>
           </w:tcPr>
           <w:p>
             <w:pPr>
@@ -2168,12 +1989,6 @@
         <w:tc>
           <w:tcPr>
             <w:tcW w:type="dxa" w:w="5472"/>
-            <w:tcMar>
-              <w:top w:w="60" w:type="dxa"/>
-              <w:left w:w="60" w:type="dxa"/>
-              <w:bottom w:w="60" w:type="dxa"/>
-              <w:right w:w="60" w:type="dxa"/>
-            </w:tcMar>
           </w:tcPr>
           <w:p>
             <w:pPr>
@@ -2192,12 +2007,6 @@
         <w:tc>
           <w:tcPr>
             <w:tcW w:type="dxa" w:w="2304"/>
-            <w:tcMar>
-              <w:top w:w="60" w:type="dxa"/>
-              <w:left w:w="60" w:type="dxa"/>
-              <w:bottom w:w="60" w:type="dxa"/>
-              <w:right w:w="60" w:type="dxa"/>
-            </w:tcMar>
           </w:tcPr>
           <w:p>
             <w:pPr>
@@ -2216,12 +2025,6 @@
         <w:tc>
           <w:tcPr>
             <w:tcW w:type="dxa" w:w="1008"/>
-            <w:tcMar>
-              <w:top w:w="60" w:type="dxa"/>
-              <w:left w:w="60" w:type="dxa"/>
-              <w:bottom w:w="60" w:type="dxa"/>
-              <w:right w:w="60" w:type="dxa"/>
-            </w:tcMar>
           </w:tcPr>
           <w:p>
             <w:pPr>
@@ -2240,12 +2043,6 @@
         <w:tc>
           <w:tcPr>
             <w:tcW w:type="dxa" w:w="1008"/>
-            <w:tcMar>
-              <w:top w:w="60" w:type="dxa"/>
-              <w:left w:w="60" w:type="dxa"/>
-              <w:bottom w:w="60" w:type="dxa"/>
-              <w:right w:w="60" w:type="dxa"/>
-            </w:tcMar>
           </w:tcPr>
           <w:p>
             <w:pPr>
@@ -2266,12 +2063,6 @@
         <w:tc>
           <w:tcPr>
             <w:tcW w:type="dxa" w:w="5472"/>
-            <w:tcMar>
-              <w:top w:w="60" w:type="dxa"/>
-              <w:left w:w="60" w:type="dxa"/>
-              <w:bottom w:w="60" w:type="dxa"/>
-              <w:right w:w="60" w:type="dxa"/>
-            </w:tcMar>
           </w:tcPr>
           <w:p>
             <w:pPr>
@@ -2290,12 +2081,6 @@
         <w:tc>
           <w:tcPr>
             <w:tcW w:type="dxa" w:w="2304"/>
-            <w:tcMar>
-              <w:top w:w="60" w:type="dxa"/>
-              <w:left w:w="60" w:type="dxa"/>
-              <w:bottom w:w="60" w:type="dxa"/>
-              <w:right w:w="60" w:type="dxa"/>
-            </w:tcMar>
           </w:tcPr>
           <w:p>
             <w:pPr>
@@ -2314,12 +2099,6 @@
         <w:tc>
           <w:tcPr>
             <w:tcW w:type="dxa" w:w="1008"/>
-            <w:tcMar>
-              <w:top w:w="60" w:type="dxa"/>
-              <w:left w:w="60" w:type="dxa"/>
-              <w:bottom w:w="60" w:type="dxa"/>
-              <w:right w:w="60" w:type="dxa"/>
-            </w:tcMar>
           </w:tcPr>
           <w:p>
             <w:pPr>
@@ -2338,12 +2117,6 @@
         <w:tc>
           <w:tcPr>
             <w:tcW w:type="dxa" w:w="1008"/>
-            <w:tcMar>
-              <w:top w:w="60" w:type="dxa"/>
-              <w:left w:w="60" w:type="dxa"/>
-              <w:bottom w:w="60" w:type="dxa"/>
-              <w:right w:w="60" w:type="dxa"/>
-            </w:tcMar>
           </w:tcPr>
           <w:p>
             <w:pPr>
@@ -2364,12 +2137,6 @@
         <w:tc>
           <w:tcPr>
             <w:tcW w:type="dxa" w:w="5472"/>
-            <w:tcMar>
-              <w:top w:w="60" w:type="dxa"/>
-              <w:left w:w="60" w:type="dxa"/>
-              <w:bottom w:w="60" w:type="dxa"/>
-              <w:right w:w="60" w:type="dxa"/>
-            </w:tcMar>
           </w:tcPr>
           <w:p>
             <w:pPr>
@@ -2388,12 +2155,6 @@
         <w:tc>
           <w:tcPr>
             <w:tcW w:type="dxa" w:w="2304"/>
-            <w:tcMar>
-              <w:top w:w="60" w:type="dxa"/>
-              <w:left w:w="60" w:type="dxa"/>
-              <w:bottom w:w="60" w:type="dxa"/>
-              <w:right w:w="60" w:type="dxa"/>
-            </w:tcMar>
           </w:tcPr>
           <w:p>
             <w:pPr>
@@ -2412,12 +2173,6 @@
         <w:tc>
           <w:tcPr>
             <w:tcW w:type="dxa" w:w="1008"/>
-            <w:tcMar>
-              <w:top w:w="60" w:type="dxa"/>
-              <w:left w:w="60" w:type="dxa"/>
-              <w:bottom w:w="60" w:type="dxa"/>
-              <w:right w:w="60" w:type="dxa"/>
-            </w:tcMar>
           </w:tcPr>
           <w:p>
             <w:pPr>
@@ -2436,12 +2191,6 @@
         <w:tc>
           <w:tcPr>
             <w:tcW w:type="dxa" w:w="1008"/>
-            <w:tcMar>
-              <w:top w:w="60" w:type="dxa"/>
-              <w:left w:w="60" w:type="dxa"/>
-              <w:bottom w:w="60" w:type="dxa"/>
-              <w:right w:w="60" w:type="dxa"/>
-            </w:tcMar>
           </w:tcPr>
           <w:p>
             <w:pPr>
@@ -2462,12 +2211,6 @@
         <w:tc>
           <w:tcPr>
             <w:tcW w:type="dxa" w:w="5472"/>
-            <w:tcMar>
-              <w:top w:w="60" w:type="dxa"/>
-              <w:left w:w="60" w:type="dxa"/>
-              <w:bottom w:w="60" w:type="dxa"/>
-              <w:right w:w="60" w:type="dxa"/>
-            </w:tcMar>
           </w:tcPr>
           <w:p>
             <w:pPr>
@@ -2486,12 +2229,6 @@
         <w:tc>
           <w:tcPr>
             <w:tcW w:type="dxa" w:w="2304"/>
-            <w:tcMar>
-              <w:top w:w="60" w:type="dxa"/>
-              <w:left w:w="60" w:type="dxa"/>
-              <w:bottom w:w="60" w:type="dxa"/>
-              <w:right w:w="60" w:type="dxa"/>
-            </w:tcMar>
           </w:tcPr>
           <w:p>
             <w:pPr>
@@ -2510,12 +2247,6 @@
         <w:tc>
           <w:tcPr>
             <w:tcW w:type="dxa" w:w="1008"/>
-            <w:tcMar>
-              <w:top w:w="60" w:type="dxa"/>
-              <w:left w:w="60" w:type="dxa"/>
-              <w:bottom w:w="60" w:type="dxa"/>
-              <w:right w:w="60" w:type="dxa"/>
-            </w:tcMar>
           </w:tcPr>
           <w:p>
             <w:pPr>
@@ -2534,12 +2265,6 @@
         <w:tc>
           <w:tcPr>
             <w:tcW w:type="dxa" w:w="1008"/>
-            <w:tcMar>
-              <w:top w:w="60" w:type="dxa"/>
-              <w:left w:w="60" w:type="dxa"/>
-              <w:bottom w:w="60" w:type="dxa"/>
-              <w:right w:w="60" w:type="dxa"/>
-            </w:tcMar>
           </w:tcPr>
           <w:p>
             <w:pPr>
@@ -2560,12 +2285,6 @@
         <w:tc>
           <w:tcPr>
             <w:tcW w:type="dxa" w:w="5472"/>
-            <w:tcMar>
-              <w:top w:w="60" w:type="dxa"/>
-              <w:left w:w="60" w:type="dxa"/>
-              <w:bottom w:w="60" w:type="dxa"/>
-              <w:right w:w="60" w:type="dxa"/>
-            </w:tcMar>
           </w:tcPr>
           <w:p>
             <w:pPr>
@@ -2584,12 +2303,6 @@
         <w:tc>
           <w:tcPr>
             <w:tcW w:type="dxa" w:w="2304"/>
-            <w:tcMar>
-              <w:top w:w="60" w:type="dxa"/>
-              <w:left w:w="60" w:type="dxa"/>
-              <w:bottom w:w="60" w:type="dxa"/>
-              <w:right w:w="60" w:type="dxa"/>
-            </w:tcMar>
           </w:tcPr>
           <w:p>
             <w:pPr>
@@ -2608,12 +2321,6 @@
         <w:tc>
           <w:tcPr>
             <w:tcW w:type="dxa" w:w="1008"/>
-            <w:tcMar>
-              <w:top w:w="60" w:type="dxa"/>
-              <w:left w:w="60" w:type="dxa"/>
-              <w:bottom w:w="60" w:type="dxa"/>
-              <w:right w:w="60" w:type="dxa"/>
-            </w:tcMar>
           </w:tcPr>
           <w:p>
             <w:pPr>
@@ -2632,12 +2339,6 @@
         <w:tc>
           <w:tcPr>
             <w:tcW w:type="dxa" w:w="1008"/>
-            <w:tcMar>
-              <w:top w:w="60" w:type="dxa"/>
-              <w:left w:w="60" w:type="dxa"/>
-              <w:bottom w:w="60" w:type="dxa"/>
-              <w:right w:w="60" w:type="dxa"/>
-            </w:tcMar>
           </w:tcPr>
           <w:p>
             <w:pPr>
@@ -2658,12 +2359,6 @@
         <w:tc>
           <w:tcPr>
             <w:tcW w:type="dxa" w:w="5472"/>
-            <w:tcMar>
-              <w:top w:w="60" w:type="dxa"/>
-              <w:left w:w="60" w:type="dxa"/>
-              <w:bottom w:w="60" w:type="dxa"/>
-              <w:right w:w="60" w:type="dxa"/>
-            </w:tcMar>
           </w:tcPr>
           <w:p>
             <w:pPr>
@@ -2682,12 +2377,6 @@
         <w:tc>
           <w:tcPr>
             <w:tcW w:type="dxa" w:w="2304"/>
-            <w:tcMar>
-              <w:top w:w="60" w:type="dxa"/>
-              <w:left w:w="60" w:type="dxa"/>
-              <w:bottom w:w="60" w:type="dxa"/>
-              <w:right w:w="60" w:type="dxa"/>
-            </w:tcMar>
           </w:tcPr>
           <w:p>
             <w:pPr>
@@ -2706,12 +2395,6 @@
         <w:tc>
           <w:tcPr>
             <w:tcW w:type="dxa" w:w="1008"/>
-            <w:tcMar>
-              <w:top w:w="60" w:type="dxa"/>
-              <w:left w:w="60" w:type="dxa"/>
-              <w:bottom w:w="60" w:type="dxa"/>
-              <w:right w:w="60" w:type="dxa"/>
-            </w:tcMar>
           </w:tcPr>
           <w:p>
             <w:pPr>
@@ -2730,12 +2413,6 @@
         <w:tc>
           <w:tcPr>
             <w:tcW w:type="dxa" w:w="1008"/>
-            <w:tcMar>
-              <w:top w:w="60" w:type="dxa"/>
-              <w:left w:w="60" w:type="dxa"/>
-              <w:bottom w:w="60" w:type="dxa"/>
-              <w:right w:w="60" w:type="dxa"/>
-            </w:tcMar>
           </w:tcPr>
           <w:p>
             <w:pPr>
@@ -2756,12 +2433,6 @@
         <w:tc>
           <w:tcPr>
             <w:tcW w:type="dxa" w:w="5472"/>
-            <w:tcMar>
-              <w:top w:w="60" w:type="dxa"/>
-              <w:left w:w="60" w:type="dxa"/>
-              <w:bottom w:w="60" w:type="dxa"/>
-              <w:right w:w="60" w:type="dxa"/>
-            </w:tcMar>
           </w:tcPr>
           <w:p>
             <w:pPr>
@@ -2780,12 +2451,6 @@
         <w:tc>
           <w:tcPr>
             <w:tcW w:type="dxa" w:w="2304"/>
-            <w:tcMar>
-              <w:top w:w="60" w:type="dxa"/>
-              <w:left w:w="60" w:type="dxa"/>
-              <w:bottom w:w="60" w:type="dxa"/>
-              <w:right w:w="60" w:type="dxa"/>
-            </w:tcMar>
           </w:tcPr>
           <w:p>
             <w:pPr>
@@ -2804,12 +2469,6 @@
         <w:tc>
           <w:tcPr>
             <w:tcW w:type="dxa" w:w="1008"/>
-            <w:tcMar>
-              <w:top w:w="60" w:type="dxa"/>
-              <w:left w:w="60" w:type="dxa"/>
-              <w:bottom w:w="60" w:type="dxa"/>
-              <w:right w:w="60" w:type="dxa"/>
-            </w:tcMar>
           </w:tcPr>
           <w:p>
             <w:pPr>
@@ -2828,12 +2487,6 @@
         <w:tc>
           <w:tcPr>
             <w:tcW w:type="dxa" w:w="1008"/>
-            <w:tcMar>
-              <w:top w:w="60" w:type="dxa"/>
-              <w:left w:w="60" w:type="dxa"/>
-              <w:bottom w:w="60" w:type="dxa"/>
-              <w:right w:w="60" w:type="dxa"/>
-            </w:tcMar>
           </w:tcPr>
           <w:p>
             <w:pPr>
@@ -2854,12 +2507,6 @@
         <w:tc>
           <w:tcPr>
             <w:tcW w:type="dxa" w:w="5472"/>
-            <w:tcMar>
-              <w:top w:w="60" w:type="dxa"/>
-              <w:left w:w="60" w:type="dxa"/>
-              <w:bottom w:w="60" w:type="dxa"/>
-              <w:right w:w="60" w:type="dxa"/>
-            </w:tcMar>
           </w:tcPr>
           <w:p>
             <w:pPr>
@@ -2878,12 +2525,6 @@
         <w:tc>
           <w:tcPr>
             <w:tcW w:type="dxa" w:w="2304"/>
-            <w:tcMar>
-              <w:top w:w="60" w:type="dxa"/>
-              <w:left w:w="60" w:type="dxa"/>
-              <w:bottom w:w="60" w:type="dxa"/>
-              <w:right w:w="60" w:type="dxa"/>
-            </w:tcMar>
           </w:tcPr>
           <w:p>
             <w:pPr>
@@ -2902,12 +2543,6 @@
         <w:tc>
           <w:tcPr>
             <w:tcW w:type="dxa" w:w="1008"/>
-            <w:tcMar>
-              <w:top w:w="60" w:type="dxa"/>
-              <w:left w:w="60" w:type="dxa"/>
-              <w:bottom w:w="60" w:type="dxa"/>
-              <w:right w:w="60" w:type="dxa"/>
-            </w:tcMar>
           </w:tcPr>
           <w:p>
             <w:pPr>
@@ -2926,12 +2561,6 @@
         <w:tc>
           <w:tcPr>
             <w:tcW w:type="dxa" w:w="1008"/>
-            <w:tcMar>
-              <w:top w:w="60" w:type="dxa"/>
-              <w:left w:w="60" w:type="dxa"/>
-              <w:bottom w:w="60" w:type="dxa"/>
-              <w:right w:w="60" w:type="dxa"/>
-            </w:tcMar>
           </w:tcPr>
           <w:p>
             <w:pPr>
@@ -2951,25 +2580,25 @@
     </w:tbl>
     <w:p>
       <w:pPr>
-        <w:pBdr>
-          <w:bottom w:val="single" w:sz="6" w:space="1" w:color="BFBFBF"/>
-        </w:pBdr>
         <w:spacing w:before="80" w:after="80"/>
-      </w:pPr>
+        <w:jc w:val="center"/>
+      </w:pPr>
+      <w:r>
+        <w:rPr>
+          <w:color w:val="BFBFBF"/>
+          <w:sz w:val="18"/>
+        </w:rPr>
+        <w:t>――――――――――――――――――――――――――――――――――――――――</w:t>
+      </w:r>
     </w:p>
     <w:p>
       <w:pPr>
-        <w:keepNext/>
+        <w:pStyle w:val="Heading2"/>
         <w:spacing w:before="360" w:after="160"/>
-        <w:pBdr>
-          <w:bottom w:val="single" w:sz="6" w:space="4" w:color="2c3e50"/>
-        </w:pBdr>
       </w:pPr>
       <w:r>
         <w:rPr>
-          <w:b/>
           <w:color w:val="2C3E50"/>
-          <w:sz w:val="28"/>
         </w:rPr>
         <w:t>Before This Can Be Submitted</w:t>
       </w:r>
@@ -3033,11 +2662,16 @@
     </w:p>
     <w:p>
       <w:pPr>
-        <w:pBdr>
-          <w:bottom w:val="single" w:sz="6" w:space="1" w:color="BFBFBF"/>
-        </w:pBdr>
         <w:spacing w:before="80" w:after="80"/>
-      </w:pPr>
+        <w:jc w:val="center"/>
+      </w:pPr>
+      <w:r>
+        <w:rPr>
+          <w:color w:val="BFBFBF"/>
+          <w:sz w:val="18"/>
+        </w:rPr>
+        <w:t>――――――――――――――――――――――――――――――――――――――――</w:t>
+      </w:r>
     </w:p>
     <w:p>
       <w:pPr>

</xml_diff>